<commit_message>
Updated srs and dds files
</commit_message>
<xml_diff>
--- a/srs/temperature_monitoring_system.docx
+++ b/srs/temperature_monitoring_system.docx
@@ -611,7 +611,7 @@
           <w:i/>
           <w:iCs/>
         </w:rPr>
-        <w:t>w</w:t>
+        <w:t>n</w:t>
       </w:r>
       <w:r>
         <w:t xml:space="preserve"> (alarm on time)</w:t>
@@ -746,35 +746,7 @@
           <w:i/>
           <w:iCs/>
         </w:rPr>
-        <w:t xml:space="preserve">larm on time, </w:t>
-      </w:r>
-      <w:r>
-        <w:rPr>
-          <w:i/>
-          <w:iCs/>
-        </w:rPr>
-        <w:t>if the measured temperature is above</w:t>
-      </w:r>
-      <w:r>
-        <w:rPr>
-          <w:i/>
-          <w:iCs/>
-        </w:rPr>
-        <w:t xml:space="preserve"> </w:t>
-      </w:r>
-      <w:r>
-        <w:rPr>
-          <w:i/>
-          <w:iCs/>
-        </w:rPr>
-        <w:t>temperature threshold level</w:t>
-      </w:r>
-      <w:r>
-        <w:rPr>
-          <w:i/>
-          <w:iCs/>
-        </w:rPr>
-        <w:t xml:space="preserve"> alarm will</w:t>
+        <w:t>larm on time, if the measured temperature is above temperature threshold level alarm will</w:t>
       </w:r>
       <w:r>
         <w:t xml:space="preserve"> be activated for w seconds.</w:t>
@@ -792,7 +764,10 @@
         <w:t xml:space="preserve"> :</w:t>
       </w:r>
       <w:r>
-        <w:t xml:space="preserve"> The minimum temperature the sensor can detected</w:t>
+        <w:t xml:space="preserve"> The minimum temperature the sensor can detect</w:t>
+      </w:r>
+      <w:r>
+        <w:t>.</w:t>
       </w:r>
     </w:p>
     <w:p>
@@ -808,6 +783,9 @@
       </w:r>
       <w:r>
         <w:t>e maximum temperature the sensor can detect</w:t>
+      </w:r>
+      <w:r>
+        <w:t>.</w:t>
       </w:r>
     </w:p>
     <w:p>

</xml_diff>